<commit_message>
docs: regenerate the .docx copies whose Markdown changed
ADRs and Security Spec follow ADR-0017. Also adds the T-020, T-021 and T-022
build-log .docx, which were never generated when those tasks merged.

Co-Authored-By: Claude Opus 5 <noreply@anthropic.com>
</commit_message>
<xml_diff>
--- a/docs/spec/Nidan_ADRs.docx
+++ b/docs/spec/Nidan_ADRs.docx
@@ -17,7 +17,7 @@
           <w:i/>
           <w:sz w:val="17"/>
         </w:rPr>
-        <w:t>Nidan · generated from docs/spec/adr/.combined.md on 2026-09-21</w:t>
+        <w:t>Nidan · generated from docs/spec/adr/.combined.md on 2026-10-28</w:t>
       </w:r>
     </w:p>
     <w:p>
@@ -5427,6 +5427,531 @@
       </w:r>
       <w:r>
         <w:t xml:space="preserve"> so a local stack works unconfigured; a production deployment should grant it to the application's own login user instead</w:t>
+      </w:r>
+    </w:p>
+    <w:p/>
+    <w:p>
+      <w:pPr>
+        <w:pStyle w:val="Heading1"/>
+      </w:pPr>
+      <w:r>
+        <w:t>ADR-0017 · Data residency in the EU (Frankfurt)</w:t>
+      </w:r>
+    </w:p>
+    <w:tbl>
+      <w:tblPr>
+        <w:tblStyle w:val="LightGrid-Accent1"/>
+        <w:tblW w:type="auto" w:w="0"/>
+        <w:tblLook w:firstColumn="1" w:firstRow="1" w:lastColumn="0" w:lastRow="0" w:noHBand="0" w:noVBand="1" w:val="04A0"/>
+      </w:tblPr>
+      <w:tblGrid>
+        <w:gridCol w:w="4320"/>
+        <w:gridCol w:w="4320"/>
+      </w:tblGrid>
+      <w:tr>
+        <w:tc>
+          <w:tcPr>
+            <w:tcW w:type="dxa" w:w="4320"/>
+          </w:tcPr>
+          <w:p>
+            <w:r>
+              <w:rPr>
+                <w:b/>
+              </w:rPr>
+              <w:t>Status</w:t>
+            </w:r>
+          </w:p>
+        </w:tc>
+        <w:tc>
+          <w:tcPr>
+            <w:tcW w:type="dxa" w:w="4320"/>
+          </w:tcPr>
+          <w:p>
+            <w:r>
+              <w:rPr>
+                <w:b/>
+              </w:rPr>
+              <w:t>Accepted</w:t>
+            </w:r>
+          </w:p>
+        </w:tc>
+      </w:tr>
+      <w:tr>
+        <w:tc>
+          <w:tcPr>
+            <w:tcW w:type="dxa" w:w="4320"/>
+          </w:tcPr>
+          <w:p>
+            <w:r>
+              <w:rPr>
+                <w:b/>
+              </w:rPr>
+              <w:t>Date</w:t>
+            </w:r>
+          </w:p>
+        </w:tc>
+        <w:tc>
+          <w:tcPr>
+            <w:tcW w:type="dxa" w:w="4320"/>
+          </w:tcPr>
+          <w:p>
+            <w:r>
+              <w:t>2026-10-28</w:t>
+            </w:r>
+          </w:p>
+        </w:tc>
+      </w:tr>
+      <w:tr>
+        <w:tc>
+          <w:tcPr>
+            <w:tcW w:type="dxa" w:w="4320"/>
+          </w:tcPr>
+          <w:p>
+            <w:r>
+              <w:rPr>
+                <w:b/>
+              </w:rPr>
+              <w:t>Deciders</w:t>
+            </w:r>
+          </w:p>
+        </w:tc>
+        <w:tc>
+          <w:tcPr>
+            <w:tcW w:type="dxa" w:w="4320"/>
+          </w:tcPr>
+          <w:p>
+            <w:r>
+              <w:t>Vraj Patel, Yogesh Bagotia</w:t>
+            </w:r>
+          </w:p>
+        </w:tc>
+      </w:tr>
+      <w:tr>
+        <w:tc>
+          <w:tcPr>
+            <w:tcW w:type="dxa" w:w="4320"/>
+          </w:tcPr>
+          <w:p>
+            <w:r>
+              <w:rPr>
+                <w:b/>
+              </w:rPr>
+              <w:t>Supersedes</w:t>
+            </w:r>
+          </w:p>
+        </w:tc>
+        <w:tc>
+          <w:tcPr>
+            <w:tcW w:type="dxa" w:w="4320"/>
+          </w:tcPr>
+          <w:p>
+            <w:r>
+              <w:t>—</w:t>
+            </w:r>
+          </w:p>
+        </w:tc>
+      </w:tr>
+    </w:tbl>
+    <w:p>
+      <w:pPr>
+        <w:pStyle w:val="Heading2"/>
+      </w:pPr>
+      <w:r>
+        <w:t>Context</w:t>
+      </w:r>
+    </w:p>
+    <w:p>
+      <w:r>
+        <w:rPr>
+          <w:rFonts w:ascii="Consolas" w:hAnsi="Consolas"/>
+          <w:sz w:val="19"/>
+        </w:rPr>
+        <w:t>SECURITY_SPEC</w:t>
+      </w:r>
+      <w:r>
+        <w:t xml:space="preserve"> S-4 has carried a ⟨DECIDE⟩ marker since 5 September 2026, and D-7 made it harder rather than easier: a </w:t>
+      </w:r>
+      <w:r>
+        <w:rPr>
+          <w:b/>
+        </w:rPr>
+        <w:t>global English-speaking launch</w:t>
+      </w:r>
+      <w:r>
+        <w:t xml:space="preserve"> means UK and EU users from day one.</w:t>
+      </w:r>
+    </w:p>
+    <w:p>
+      <w:r>
+        <w:t>Three facts constrain the choice.</w:t>
+      </w:r>
+    </w:p>
+    <w:p>
+      <w:r>
+        <w:rPr>
+          <w:b/>
+        </w:rPr>
+        <w:t>GDPR applies because of who the users are, not where the database is.</w:t>
+      </w:r>
+      <w:r>
+        <w:t xml:space="preserve"> Article 3(2) binds any controller offering services to people in the Union, wherever the controller or its infrastructure sits. So no region avoids GDPR. The region decides something narrower.</w:t>
+      </w:r>
+    </w:p>
+    <w:p>
+      <w:r>
+        <w:rPr>
+          <w:b/>
+        </w:rPr>
+        <w:t>What the region decides is Chapter V.</w:t>
+      </w:r>
+      <w:r>
+        <w:t xml:space="preserve"> Personal data leaving the EEA is a restricted transfer, and lawful only under a transfer mechanism — an adequacy decision, or standard contractual clauses backed by a transfer impact assessment. That is paperwork, periodic review, and a dependency on the destination country's surveillance law. Keeping the data in the EEA removes the obligation rather than satisfying it.</w:t>
+      </w:r>
+    </w:p>
+    <w:p>
+      <w:r>
+        <w:rPr>
+          <w:b/>
+        </w:rPr>
+        <w:t>The obligation is one-directional.</w:t>
+      </w:r>
+      <w:r>
+        <w:t xml:space="preserve"> No comparable restriction stops an Indian, Australian or US user's data from sitting in Frankfurt. The asymmetry is the whole decision: one region creates legal work, the other does not, and it is the same database either way.</w:t>
+      </w:r>
+    </w:p>
+    <w:p>
+      <w:r>
+        <w:t>Against that, latency. One database, one region, and a user base spread across at least three continents — someone is always far away.</w:t>
+      </w:r>
+    </w:p>
+    <w:p>
+      <w:r>
+        <w:rPr>
+          <w:rFonts w:ascii="Consolas" w:hAnsi="Consolas"/>
+          <w:sz w:val="19"/>
+        </w:rPr>
+        <w:t>ADR-0001</w:t>
+      </w:r>
+      <w:r>
+        <w:t xml:space="preserve"> already placed PostgreSQL on Supabase, and </w:t>
+      </w:r>
+      <w:r>
+        <w:rPr>
+          <w:rFonts w:ascii="Consolas" w:hAnsi="Consolas"/>
+          <w:sz w:val="19"/>
+        </w:rPr>
+        <w:t>ADR-0002</w:t>
+      </w:r>
+      <w:r>
+        <w:t xml:space="preserve"> placed authentication there too, so this is one project and one jurisdiction for both. A Supabase project cannot be moved between regions; changing this means creating a new project and migrating.</w:t>
+      </w:r>
+    </w:p>
+    <w:p>
+      <w:pPr>
+        <w:pStyle w:val="Heading2"/>
+      </w:pPr>
+      <w:r>
+        <w:t>Decision</w:t>
+      </w:r>
+    </w:p>
+    <w:p>
+      <w:r>
+        <w:rPr>
+          <w:b/>
+        </w:rPr>
+        <w:t>Central EU (Frankfurt), `eu-central-1`.</w:t>
+      </w:r>
+    </w:p>
+    <w:p>
+      <w:r>
+        <w:t>One Supabase project holds both the database and GoTrue, created 28 October 2026.</w:t>
+      </w:r>
+    </w:p>
+    <w:p>
+      <w:r>
+        <w:t>EU users are served from inside the EEA, so Chapter V does not engage for them. UK users rely on the UK's own finding that the EEA offers adequate protection — a transfer in that direction, from a UK data subject to an EU processor, is the well-supported one. Users outside Europe bring no residency constraint of their own.</w:t>
+      </w:r>
+    </w:p>
+    <w:p>
+      <w:r>
+        <w:t>Latency is accepted as the cost: roughly 120–150 ms from India and 80–100 ms from the US east coast. A consultation is turn-based text, and the LLM call already dominates every response by an order of magnitude, so the round trip is not perceptible where it lands.</w:t>
+      </w:r>
+    </w:p>
+    <w:p>
+      <w:pPr>
+        <w:pStyle w:val="Heading2"/>
+      </w:pPr>
+      <w:r>
+        <w:t>Alternatives considered</w:t>
+      </w:r>
+    </w:p>
+    <w:tbl>
+      <w:tblPr>
+        <w:tblStyle w:val="LightGrid-Accent1"/>
+        <w:tblW w:type="auto" w:w="0"/>
+        <w:tblLook w:firstColumn="1" w:firstRow="1" w:lastColumn="0" w:lastRow="0" w:noHBand="0" w:noVBand="1" w:val="04A0"/>
+      </w:tblPr>
+      <w:tblGrid>
+        <w:gridCol w:w="4320"/>
+        <w:gridCol w:w="4320"/>
+      </w:tblGrid>
+      <w:tr>
+        <w:tc>
+          <w:tcPr>
+            <w:tcW w:type="dxa" w:w="4320"/>
+          </w:tcPr>
+          <w:p>
+            <w:r>
+              <w:rPr>
+                <w:b/>
+              </w:rPr>
+              <w:t>Option</w:t>
+            </w:r>
+          </w:p>
+        </w:tc>
+        <w:tc>
+          <w:tcPr>
+            <w:tcW w:type="dxa" w:w="4320"/>
+          </w:tcPr>
+          <w:p>
+            <w:r>
+              <w:rPr>
+                <w:b/>
+              </w:rPr>
+              <w:t>Why rejected</w:t>
+            </w:r>
+          </w:p>
+        </w:tc>
+      </w:tr>
+      <w:tr>
+        <w:tc>
+          <w:tcPr>
+            <w:tcW w:type="dxa" w:w="4320"/>
+          </w:tcPr>
+          <w:p>
+            <w:r>
+              <w:rPr>
+                <w:b/>
+              </w:rPr>
+              <w:t>London, `eu-west-2`</w:t>
+            </w:r>
+          </w:p>
+        </w:tc>
+        <w:tc>
+          <w:tcPr>
+            <w:tcW w:type="dxa" w:w="4320"/>
+          </w:tcPr>
+          <w:p>
+            <w:r>
+              <w:t xml:space="preserve">Equivalent for UK users and marginally closer to India. Rejected because it inverts the dependency: EU users' data in the UK relies on the EU's adequacy decision </w:t>
+            </w:r>
+            <w:r>
+              <w:rPr>
+                <w:i/>
+              </w:rPr>
+              <w:t>for</w:t>
+            </w:r>
+            <w:r>
+              <w:t xml:space="preserve"> the UK, which is renewable and has been subject to periodic review, whereas the UK's recognition of the EEA is the stabler direction. Choosing the renewable side of a reciprocal pair, for a project that cannot change region later, is the worse of two similar options.</w:t>
+            </w:r>
+          </w:p>
+        </w:tc>
+      </w:tr>
+      <w:tr>
+        <w:tc>
+          <w:tcPr>
+            <w:tcW w:type="dxa" w:w="4320"/>
+          </w:tcPr>
+          <w:p>
+            <w:r>
+              <w:rPr>
+                <w:b/>
+              </w:rPr>
+              <w:t>Mumbai, `ap-south-1`</w:t>
+            </w:r>
+          </w:p>
+        </w:tc>
+        <w:tc>
+          <w:tcPr>
+            <w:tcW w:type="dxa" w:w="4320"/>
+          </w:tcPr>
+          <w:p>
+            <w:r>
+              <w:t>Best latency for the team and for any India-based pilot cohort, and genuinely tempting while the only users are local. Rejected because it takes on SCCs and a transfer impact assessment as a precondition of the launch D-7 already committed to — legal work that scales with the thing we most want to do.</w:t>
+            </w:r>
+          </w:p>
+        </w:tc>
+      </w:tr>
+      <w:tr>
+        <w:tc>
+          <w:tcPr>
+            <w:tcW w:type="dxa" w:w="4320"/>
+          </w:tcPr>
+          <w:p>
+            <w:r>
+              <w:rPr>
+                <w:b/>
+              </w:rPr>
+              <w:t>US East, `us-east-1`</w:t>
+            </w:r>
+          </w:p>
+        </w:tc>
+        <w:tc>
+          <w:tcPr>
+            <w:tcW w:type="dxa" w:w="4320"/>
+          </w:tcPr>
+          <w:p>
+            <w:r>
+              <w:t>Supabase's default and its best-tested region. Rejected for the same Chapter V exposure as Mumbai, with none of its latency benefit for us, and with a destination whose surveillance law is the subject of the case history that invalidated two previous adequacy frameworks.</w:t>
+            </w:r>
+          </w:p>
+        </w:tc>
+      </w:tr>
+      <w:tr>
+        <w:tc>
+          <w:tcPr>
+            <w:tcW w:type="dxa" w:w="4320"/>
+          </w:tcPr>
+          <w:p>
+            <w:r>
+              <w:rPr>
+                <w:b/>
+              </w:rPr>
+              <w:t>Two regions, routed by user</w:t>
+            </w:r>
+          </w:p>
+        </w:tc>
+        <w:tc>
+          <w:tcPr>
+            <w:tcW w:type="dxa" w:w="4320"/>
+          </w:tcPr>
+          <w:p>
+            <w:r>
+              <w:t xml:space="preserve">Removes the trade-off and introduces a far worse one. Two databases means the assessment engine's </w:t>
+            </w:r>
+            <w:r>
+              <w:rPr>
+                <w:rFonts w:ascii="Consolas" w:hAnsi="Consolas"/>
+                <w:sz w:val="19"/>
+              </w:rPr>
+              <w:t>engine_versions</w:t>
+            </w:r>
+            <w:r>
+              <w:t xml:space="preserve"> pinning, the golden record and the 16 backfilled pilot sessions all fork, and </w:t>
+            </w:r>
+            <w:r>
+              <w:rPr>
+                <w:rFonts w:ascii="Consolas" w:hAnsi="Consolas"/>
+                <w:sz w:val="19"/>
+              </w:rPr>
+              <w:t>ADR-0003</w:t>
+            </w:r>
+            <w:r>
+              <w:t>'s single event log stops being single. Not worth it at any plausible scale for this product.</w:t>
+            </w:r>
+          </w:p>
+        </w:tc>
+      </w:tr>
+      <w:tr>
+        <w:tc>
+          <w:tcPr>
+            <w:tcW w:type="dxa" w:w="4320"/>
+          </w:tcPr>
+          <w:p>
+            <w:r>
+              <w:rPr>
+                <w:b/>
+              </w:rPr>
+              <w:t>Defer until launch</w:t>
+            </w:r>
+          </w:p>
+        </w:tc>
+        <w:tc>
+          <w:tcPr>
+            <w:tcW w:type="dxa" w:w="4320"/>
+          </w:tcPr>
+          <w:p>
+            <w:r>
+              <w:t>The status quo, and the reason this sat open for seven weeks. Rejected because the project had to be created to unblock T-023 regardless, and a region chosen incidentally to unblock a local sign-in is a jurisdiction chosen by accident.</w:t>
+            </w:r>
+          </w:p>
+        </w:tc>
+      </w:tr>
+    </w:tbl>
+    <w:p>
+      <w:pPr>
+        <w:pStyle w:val="Heading2"/>
+      </w:pPr>
+      <w:r>
+        <w:t>Consequences</w:t>
+      </w:r>
+    </w:p>
+    <w:p>
+      <w:pPr>
+        <w:pStyle w:val="ListBullet"/>
+      </w:pPr>
+      <w:r>
+        <w:rPr>
+          <w:rFonts w:ascii="Consolas" w:hAnsi="Consolas"/>
+          <w:sz w:val="19"/>
+        </w:rPr>
+        <w:t>SECURITY_SPEC</w:t>
+      </w:r>
+      <w:r>
+        <w:t xml:space="preserve"> S-4 is closed; the last open ⟨DECIDE⟩ item is settled</w:t>
+      </w:r>
+    </w:p>
+    <w:p>
+      <w:pPr>
+        <w:pStyle w:val="ListBullet"/>
+      </w:pPr>
+      <w:r>
+        <w:t>No Chapter V transfer mechanism, transfer impact assessment or SCC review is needed for EU users</w:t>
+      </w:r>
+    </w:p>
+    <w:p>
+      <w:pPr>
+        <w:pStyle w:val="ListBullet"/>
+      </w:pPr>
+      <w:r>
+        <w:t>The privacy policy (S-7) can state a single, stable processing location</w:t>
+      </w:r>
+    </w:p>
+    <w:p>
+      <w:pPr>
+        <w:pStyle w:val="ListBullet"/>
+      </w:pPr>
+      <w:r>
+        <w:t>Auth and data share one jurisdiction, so there is no second residency question for GoTrue</w:t>
+      </w:r>
+    </w:p>
+    <w:p>
+      <w:r>
+        <w:t>− Latency of roughly 120–150 ms for users in India, including the team during development</w:t>
+      </w:r>
+    </w:p>
+    <w:p>
+      <w:r>
+        <w:t>− A later decision to move is a new project and a data migration, not a setting</w:t>
+      </w:r>
+    </w:p>
+    <w:p>
+      <w:r>
+        <w:t>− UK coverage depends on the UK's recognition of the EEA; if that position ever changed, UK users would need their own mechanism. Worth re-reading at S-7 when the privacy policy is written</w:t>
+      </w:r>
+    </w:p>
+    <w:p>
+      <w:r>
+        <w:t xml:space="preserve">− Nothing here addresses </w:t>
+      </w:r>
+      <w:r>
+        <w:rPr>
+          <w:i/>
+        </w:rPr>
+        <w:t>what</w:t>
+      </w:r>
+      <w:r>
+        <w:t xml:space="preserve"> is stored, only where. The group-size floor in S-1 and the aggregate-only institutional view remain the decisions that matter more for trust</w:t>
       </w:r>
     </w:p>
     <w:p/>

</xml_diff>